<commit_message>
technical_report.md의 유용한 내용을 PDF/DOCX로 병합 후 md 삭제
- Wilson 랭킹 개선 전후 실제 사례(Drama+acting) 추가
- 장르 다의어 오분류(scary→Horror) 실측 검증 상세 추가
- 부정 의미 키워드(boring 등) 제외 근거 추가
- 테스트 환경(OS/Python/TF/Keras 버전) 표 추가
- 서로 다른 두 개의 기술 보고서(md/docx)가 공존하며 내용이
  어긋나던 문제 해결 — docx/pdf를 단일 공식 문서로 통일
- README가 technical_report.docx/.pdf를 가리키도록 수정

Co-Authored-By: Claude <noreply@anthropic.com>
</commit_message>
<xml_diff>
--- a/technical_report.docx
+++ b/technical_report.docx
@@ -4851,6 +4851,841 @@
       </w:r>
     </w:p>
     <w:p>
+      <w:pPr>
+        <w:spacing w:before="0" w:after="120"/>
+      </w:pPr>
+      <w:r>
+        <w:rPr>
+          <w:rFonts w:eastAsia="Malgun Gothic"/>
+          <w:rFonts w:ascii="Malgun Gothic" w:hAnsi="Malgun Gothic"/>
+          <w:b w:val="0"/>
+          <w:i w:val="0"/>
+          <w:sz w:val="22"/>
+        </w:rPr>
+        <w:t>개선 전후 비교 (Drama + acting 상위 3개):</w:t>
+      </w:r>
+    </w:p>
+    <w:tbl>
+      <w:tblPr>
+        <w:tblStyle w:val="TableGrid"/>
+        <w:tblW w:type="auto" w:w="0"/>
+        <w:tblLook w:firstColumn="1" w:firstRow="1" w:lastColumn="0" w:lastRow="0" w:noHBand="0" w:noVBand="1" w:val="04A0"/>
+      </w:tblPr>
+      <w:tblGrid>
+        <w:gridCol w:w="3024"/>
+        <w:gridCol w:w="3024"/>
+        <w:gridCol w:w="3024"/>
+      </w:tblGrid>
+      <w:tr>
+        <w:tc>
+          <w:tcPr>
+            <w:tcW w:type="dxa" w:w="1134"/>
+            <w:shd w:val="clear" w:color="auto" w:fill="D5E8F0"/>
+          </w:tcPr>
+          <w:p>
+            <w:pPr>
+              <w:jc w:val="center"/>
+            </w:pPr>
+            <w:r/>
+            <w:r>
+              <w:rPr>
+                <w:rFonts w:eastAsia="Malgun Gothic"/>
+                <w:rFonts w:ascii="Malgun Gothic" w:hAnsi="Malgun Gothic"/>
+                <w:b/>
+                <w:i w:val="0"/>
+                <w:sz w:val="20"/>
+              </w:rPr>
+              <w:t>순위</w:t>
+            </w:r>
+          </w:p>
+        </w:tc>
+        <w:tc>
+          <w:tcPr>
+            <w:tcW w:type="dxa" w:w="3685"/>
+            <w:shd w:val="clear" w:color="auto" w:fill="D5E8F0"/>
+          </w:tcPr>
+          <w:p>
+            <w:pPr>
+              <w:jc w:val="center"/>
+            </w:pPr>
+            <w:r/>
+            <w:r>
+              <w:rPr>
+                <w:rFonts w:eastAsia="Malgun Gothic"/>
+                <w:rFonts w:ascii="Malgun Gothic" w:hAnsi="Malgun Gothic"/>
+                <w:b/>
+                <w:i w:val="0"/>
+                <w:sz w:val="20"/>
+              </w:rPr>
+              <w:t>개선 전 (비율 정렬)</w:t>
+            </w:r>
+          </w:p>
+        </w:tc>
+        <w:tc>
+          <w:tcPr>
+            <w:tcW w:type="dxa" w:w="3685"/>
+            <w:shd w:val="clear" w:color="auto" w:fill="D5E8F0"/>
+          </w:tcPr>
+          <w:p>
+            <w:pPr>
+              <w:jc w:val="center"/>
+            </w:pPr>
+            <w:r/>
+            <w:r>
+              <w:rPr>
+                <w:rFonts w:eastAsia="Malgun Gothic"/>
+                <w:rFonts w:ascii="Malgun Gothic" w:hAnsi="Malgun Gothic"/>
+                <w:b/>
+                <w:i w:val="0"/>
+                <w:sz w:val="20"/>
+              </w:rPr>
+              <w:t>개선 후 (Wilson 정렬)</w:t>
+            </w:r>
+          </w:p>
+        </w:tc>
+      </w:tr>
+      <w:tr>
+        <w:tc>
+          <w:tcPr>
+            <w:tcW w:type="dxa" w:w="1134"/>
+          </w:tcPr>
+          <w:p>
+            <w:r/>
+            <w:r>
+              <w:rPr>
+                <w:rFonts w:eastAsia="Malgun Gothic"/>
+                <w:rFonts w:ascii="Malgun Gothic" w:hAnsi="Malgun Gothic"/>
+                <w:b w:val="0"/>
+                <w:i w:val="0"/>
+                <w:sz w:val="20"/>
+              </w:rPr>
+              <w:t>1</w:t>
+            </w:r>
+          </w:p>
+        </w:tc>
+        <w:tc>
+          <w:tcPr>
+            <w:tcW w:type="dxa" w:w="3685"/>
+          </w:tcPr>
+          <w:p>
+            <w:r/>
+            <w:r>
+              <w:rPr>
+                <w:rFonts w:eastAsia="Malgun Gothic"/>
+                <w:rFonts w:ascii="Malgun Gothic" w:hAnsi="Malgun Gothic"/>
+                <w:b w:val="0"/>
+                <w:i w:val="0"/>
+                <w:sz w:val="20"/>
+              </w:rPr>
+              <w:t>The Remains of the Day (22/22)</w:t>
+            </w:r>
+          </w:p>
+        </w:tc>
+        <w:tc>
+          <w:tcPr>
+            <w:tcW w:type="dxa" w:w="3685"/>
+          </w:tcPr>
+          <w:p>
+            <w:r/>
+            <w:r>
+              <w:rPr>
+                <w:rFonts w:eastAsia="Malgun Gothic"/>
+                <w:rFonts w:ascii="Malgun Gothic" w:hAnsi="Malgun Gothic"/>
+                <w:b w:val="0"/>
+                <w:i w:val="0"/>
+                <w:sz w:val="20"/>
+              </w:rPr>
+              <w:t>The Remains of the Day (22/22)</w:t>
+            </w:r>
+          </w:p>
+        </w:tc>
+      </w:tr>
+      <w:tr>
+        <w:tc>
+          <w:tcPr>
+            <w:tcW w:type="dxa" w:w="1134"/>
+          </w:tcPr>
+          <w:p>
+            <w:r/>
+            <w:r>
+              <w:rPr>
+                <w:rFonts w:eastAsia="Malgun Gothic"/>
+                <w:rFonts w:ascii="Malgun Gothic" w:hAnsi="Malgun Gothic"/>
+                <w:b w:val="0"/>
+                <w:i w:val="0"/>
+                <w:sz w:val="20"/>
+              </w:rPr>
+              <w:t>2</w:t>
+            </w:r>
+          </w:p>
+        </w:tc>
+        <w:tc>
+          <w:tcPr>
+            <w:tcW w:type="dxa" w:w="3685"/>
+          </w:tcPr>
+          <w:p>
+            <w:r/>
+            <w:r>
+              <w:rPr>
+                <w:rFonts w:eastAsia="Malgun Gothic"/>
+                <w:rFonts w:ascii="Malgun Gothic" w:hAnsi="Malgun Gothic"/>
+                <w:b w:val="0"/>
+                <w:i w:val="0"/>
+                <w:sz w:val="20"/>
+              </w:rPr>
+              <w:t>The Aviator (19/19)</w:t>
+            </w:r>
+          </w:p>
+        </w:tc>
+        <w:tc>
+          <w:tcPr>
+            <w:tcW w:type="dxa" w:w="3685"/>
+          </w:tcPr>
+          <w:p>
+            <w:r/>
+            <w:r>
+              <w:rPr>
+                <w:rFonts w:eastAsia="Malgun Gothic"/>
+                <w:rFonts w:ascii="Malgun Gothic" w:hAnsi="Malgun Gothic"/>
+                <w:b w:val="0"/>
+                <w:i w:val="0"/>
+                <w:sz w:val="20"/>
+              </w:rPr>
+              <w:t>The Aviator (19/19)</w:t>
+            </w:r>
+          </w:p>
+        </w:tc>
+      </w:tr>
+      <w:tr>
+        <w:tc>
+          <w:tcPr>
+            <w:tcW w:type="dxa" w:w="1134"/>
+          </w:tcPr>
+          <w:p>
+            <w:r/>
+            <w:r>
+              <w:rPr>
+                <w:rFonts w:eastAsia="Malgun Gothic"/>
+                <w:rFonts w:ascii="Malgun Gothic" w:hAnsi="Malgun Gothic"/>
+                <w:b w:val="0"/>
+                <w:i w:val="0"/>
+                <w:sz w:val="20"/>
+              </w:rPr>
+              <w:t>3</w:t>
+            </w:r>
+          </w:p>
+        </w:tc>
+        <w:tc>
+          <w:tcPr>
+            <w:tcW w:type="dxa" w:w="3685"/>
+          </w:tcPr>
+          <w:p>
+            <w:r/>
+            <w:r>
+              <w:rPr>
+                <w:rFonts w:eastAsia="Malgun Gothic"/>
+                <w:rFonts w:ascii="Malgun Gothic" w:hAnsi="Malgun Gothic"/>
+                <w:b w:val="0"/>
+                <w:i w:val="0"/>
+                <w:sz w:val="20"/>
+              </w:rPr>
+              <w:t>The Verdict (17/17)</w:t>
+            </w:r>
+          </w:p>
+        </w:tc>
+        <w:tc>
+          <w:tcPr>
+            <w:tcW w:type="dxa" w:w="3685"/>
+          </w:tcPr>
+          <w:p>
+            <w:r/>
+            <w:r>
+              <w:rPr>
+                <w:rFonts w:eastAsia="Malgun Gothic"/>
+                <w:rFonts w:ascii="Malgun Gothic" w:hAnsi="Malgun Gothic"/>
+                <w:b w:val="0"/>
+                <w:i w:val="0"/>
+                <w:sz w:val="20"/>
+              </w:rPr>
+              <w:t>Mystic River (40/43) ← 큰 표본 영화 상승</w:t>
+            </w:r>
+          </w:p>
+        </w:tc>
+      </w:tr>
+    </w:tbl>
+    <w:p>
+      <w:pPr>
+        <w:spacing w:after="80"/>
+      </w:pPr>
+    </w:p>
+    <w:p>
+      <w:pPr>
+        <w:spacing w:before="0" w:after="120"/>
+      </w:pPr>
+      <w:r>
+        <w:rPr>
+          <w:rFonts w:eastAsia="Malgun Gothic"/>
+          <w:rFonts w:ascii="Malgun Gothic" w:hAnsi="Malgun Gothic"/>
+          <w:b w:val="0"/>
+          <w:i w:val="0"/>
+          <w:sz w:val="22"/>
+        </w:rPr>
+        <w:t>Doubt(89/104), 12 Years a Slave(20/21) 등 표본이 크고 비율도 높은 명작들이 상위로 올라왔다. 최소 언급 기준도 3→5건으로 올려 노이즈 하한을 강화했다.</w:t>
+      </w:r>
+    </w:p>
+    <w:p>
+      <w:pPr>
+        <w:spacing w:before="200" w:after="100"/>
+      </w:pPr>
+      <w:r>
+        <w:rPr>
+          <w:rFonts w:eastAsia="Malgun Gothic"/>
+          <w:rFonts w:ascii="Malgun Gothic" w:hAnsi="Malgun Gothic"/>
+          <w:b/>
+          <w:i w:val="0"/>
+          <w:sz w:val="26"/>
+        </w:rPr>
+        <w:t>9.3 장르 분류의 다의어 오분류</w:t>
+      </w:r>
+    </w:p>
+    <w:p>
+      <w:pPr>
+        <w:spacing w:before="0" w:after="120"/>
+      </w:pPr>
+      <w:r>
+        <w:rPr>
+          <w:rFonts w:eastAsia="Malgun Gothic"/>
+          <w:rFonts w:ascii="Malgun Gothic" w:hAnsi="Malgun Gothic"/>
+          <w:b w:val="0"/>
+          <w:i w:val="0"/>
+          <w:sz w:val="22"/>
+        </w:rPr>
+        <w:t>Wilson 랭킹 적용 후에도 Horror+scary 상위에 To All the Boys I've Loved Before(로맨스), The Muppet Christmas Carol 같은 비-공포 영화가 남았다. 원인은 감성이 아니라 장르 분류에 있었다. 장르는 리뷰의 장르 키워드 빈도로 자동 분류하는데, Horror 분류 키워드에 "scary"가 포함되어 있었다. 문제는 scary가 다의어라는 점이다 — "the ghost scenes were scary"(공포)와 "love is scary", "scary how relatable this is"(관용적 표현, 공포 아님)가 뒤섞인다.</w:t>
+      </w:r>
+    </w:p>
+    <w:p>
+      <w:pPr>
+        <w:spacing w:before="0" w:after="120"/>
+      </w:pPr>
+      <w:r>
+        <w:rPr>
+          <w:rFonts w:eastAsia="Malgun Gothic"/>
+          <w:rFonts w:ascii="Malgun Gothic" w:hAnsi="Malgun Gothic"/>
+          <w:b w:val="0"/>
+          <w:i w:val="0"/>
+          <w:sz w:val="22"/>
+        </w:rPr>
+        <w:t>scary를 제외해도 되는지 측정으로 검증했다. Horror로 분류된 915개 영화에서 scary를 뺀 공포 키워드만으로 재분류한 결과:</w:t>
+      </w:r>
+    </w:p>
+    <w:tbl>
+      <w:tblPr>
+        <w:tblStyle w:val="TableGrid"/>
+        <w:tblW w:type="auto" w:w="0"/>
+        <w:tblLook w:firstColumn="1" w:firstRow="1" w:lastColumn="0" w:lastRow="0" w:noHBand="0" w:noVBand="1" w:val="04A0"/>
+      </w:tblPr>
+      <w:tblGrid>
+        <w:gridCol w:w="4536"/>
+        <w:gridCol w:w="4536"/>
+      </w:tblGrid>
+      <w:tr>
+        <w:tc>
+          <w:tcPr>
+            <w:tcW w:type="dxa" w:w="3969"/>
+            <w:shd w:val="clear" w:color="auto" w:fill="D5E8F0"/>
+          </w:tcPr>
+          <w:p>
+            <w:pPr>
+              <w:jc w:val="center"/>
+            </w:pPr>
+            <w:r/>
+            <w:r>
+              <w:rPr>
+                <w:rFonts w:eastAsia="Malgun Gothic"/>
+                <w:rFonts w:ascii="Malgun Gothic" w:hAnsi="Malgun Gothic"/>
+                <w:b/>
+                <w:i w:val="0"/>
+                <w:sz w:val="20"/>
+              </w:rPr>
+              <w:t>구분</w:t>
+            </w:r>
+          </w:p>
+        </w:tc>
+        <w:tc>
+          <w:tcPr>
+            <w:tcW w:type="dxa" w:w="4819"/>
+            <w:shd w:val="clear" w:color="auto" w:fill="D5E8F0"/>
+          </w:tcPr>
+          <w:p>
+            <w:pPr>
+              <w:jc w:val="center"/>
+            </w:pPr>
+            <w:r/>
+            <w:r>
+              <w:rPr>
+                <w:rFonts w:eastAsia="Malgun Gothic"/>
+                <w:rFonts w:ascii="Malgun Gothic" w:hAnsi="Malgun Gothic"/>
+                <w:b/>
+                <w:i w:val="0"/>
+                <w:sz w:val="20"/>
+              </w:rPr>
+              <w:t>영화 수</w:t>
+            </w:r>
+          </w:p>
+        </w:tc>
+      </w:tr>
+      <w:tr>
+        <w:tc>
+          <w:tcPr>
+            <w:tcW w:type="dxa" w:w="3969"/>
+          </w:tcPr>
+          <w:p>
+            <w:r/>
+            <w:r>
+              <w:rPr>
+                <w:rFonts w:eastAsia="Malgun Gothic"/>
+                <w:rFonts w:ascii="Malgun Gothic" w:hAnsi="Malgun Gothic"/>
+                <w:b w:val="0"/>
+                <w:i w:val="0"/>
+                <w:sz w:val="20"/>
+              </w:rPr>
+              <w:t>scary 없이도 유지</w:t>
+            </w:r>
+          </w:p>
+        </w:tc>
+        <w:tc>
+          <w:tcPr>
+            <w:tcW w:type="dxa" w:w="4819"/>
+          </w:tcPr>
+          <w:p>
+            <w:r/>
+            <w:r>
+              <w:rPr>
+                <w:rFonts w:eastAsia="Malgun Gothic"/>
+                <w:rFonts w:ascii="Malgun Gothic" w:hAnsi="Malgun Gothic"/>
+                <w:b w:val="0"/>
+                <w:i w:val="0"/>
+                <w:sz w:val="20"/>
+              </w:rPr>
+              <w:t>886개 (96.8%)</w:t>
+            </w:r>
+          </w:p>
+        </w:tc>
+      </w:tr>
+      <w:tr>
+        <w:tc>
+          <w:tcPr>
+            <w:tcW w:type="dxa" w:w="3969"/>
+          </w:tcPr>
+          <w:p>
+            <w:r/>
+            <w:r>
+              <w:rPr>
+                <w:rFonts w:eastAsia="Malgun Gothic"/>
+                <w:rFonts w:ascii="Malgun Gothic" w:hAnsi="Malgun Gothic"/>
+                <w:b w:val="0"/>
+                <w:i w:val="0"/>
+                <w:sz w:val="20"/>
+              </w:rPr>
+              <w:t>scary 빠지면 탈락</w:t>
+            </w:r>
+          </w:p>
+        </w:tc>
+        <w:tc>
+          <w:tcPr>
+            <w:tcW w:type="dxa" w:w="4819"/>
+          </w:tcPr>
+          <w:p>
+            <w:r/>
+            <w:r>
+              <w:rPr>
+                <w:rFonts w:eastAsia="Malgun Gothic"/>
+                <w:rFonts w:ascii="Malgun Gothic" w:hAnsi="Malgun Gothic"/>
+                <w:b w:val="0"/>
+                <w:i w:val="0"/>
+                <w:sz w:val="20"/>
+              </w:rPr>
+              <w:t>29개 (3.2%)</w:t>
+            </w:r>
+          </w:p>
+        </w:tc>
+      </w:tr>
+    </w:tbl>
+    <w:p>
+      <w:pPr>
+        <w:spacing w:after="80"/>
+      </w:pPr>
+    </w:p>
+    <w:p>
+      <w:pPr>
+        <w:spacing w:before="0" w:after="120"/>
+      </w:pPr>
+      <w:r>
+        <w:rPr>
+          <w:rFonts w:eastAsia="Malgun Gothic"/>
+          <w:rFonts w:ascii="Malgun Gothic" w:hAnsi="Malgun Gothic"/>
+          <w:b w:val="0"/>
+          <w:i w:val="0"/>
+          <w:sz w:val="22"/>
+        </w:rPr>
+        <w:t>탈락한 29개를 확인하니 진짜 공포영화가 하나도 없었다 — La La Land(뮤지컬), To All the Boys(로맨스), 1917·Inglourious Basterds(전쟁), Grave of the Fireflies(전쟁 애니) 등 전부 "scary"를 관용적으로 쓴 오분류였다. 장르 분류 키워드에서만 scary를 제외(클릭 키워드로는 유지)해 Horror는 915→873개가 되었고, 상위 목록에서 비공포 영화가 사라졌다.</w:t>
+      </w:r>
+    </w:p>
+    <w:p>
+      <w:pPr>
+        <w:spacing w:before="200" w:after="100"/>
+      </w:pPr>
+      <w:r>
+        <w:rPr>
+          <w:rFonts w:eastAsia="Malgun Gothic"/>
+          <w:rFonts w:ascii="Malgun Gothic" w:hAnsi="Malgun Gothic"/>
+          <w:b/>
+          <w:i w:val="0"/>
+          <w:sz w:val="26"/>
+        </w:rPr>
+        <w:t>9.4 부정 의미 키워드 제외</w:t>
+      </w:r>
+    </w:p>
+    <w:p>
+      <w:pPr>
+        <w:spacing w:before="0" w:after="120"/>
+      </w:pPr>
+      <w:r>
+        <w:rPr>
+          <w:rFonts w:eastAsia="Malgun Gothic"/>
+          <w:rFonts w:ascii="Malgun Gothic" w:hAnsi="Malgun Gothic"/>
+          <w:b w:val="0"/>
+          <w:i w:val="0"/>
+          <w:sz w:val="22"/>
+        </w:rPr>
+        <w:t>boring/predictable/overrated/disappointing은 "긍정적으로 언급"이 성립하지 않는 키워드다. 리뷰에서 대부분 불평으로 쓰여 모델이 78~97%를 부정으로 분류한다.</w:t>
+      </w:r>
+    </w:p>
+    <w:tbl>
+      <w:tblPr>
+        <w:tblStyle w:val="TableGrid"/>
+        <w:tblW w:type="auto" w:w="0"/>
+        <w:tblLook w:firstColumn="1" w:firstRow="1" w:lastColumn="0" w:lastRow="0" w:noHBand="0" w:noVBand="1" w:val="04A0"/>
+      </w:tblPr>
+      <w:tblGrid>
+        <w:gridCol w:w="3024"/>
+        <w:gridCol w:w="3024"/>
+        <w:gridCol w:w="3024"/>
+      </w:tblGrid>
+      <w:tr>
+        <w:tc>
+          <w:tcPr>
+            <w:tcW w:type="dxa" w:w="2268"/>
+            <w:shd w:val="clear" w:color="auto" w:fill="D5E8F0"/>
+          </w:tcPr>
+          <w:p>
+            <w:pPr>
+              <w:jc w:val="center"/>
+            </w:pPr>
+            <w:r/>
+            <w:r>
+              <w:rPr>
+                <w:rFonts w:eastAsia="Malgun Gothic"/>
+                <w:rFonts w:ascii="Malgun Gothic" w:hAnsi="Malgun Gothic"/>
+                <w:b/>
+                <w:i w:val="0"/>
+                <w:sz w:val="20"/>
+              </w:rPr>
+              <w:t>키워드</w:t>
+            </w:r>
+          </w:p>
+        </w:tc>
+        <w:tc>
+          <w:tcPr>
+            <w:tcW w:type="dxa" w:w="1701"/>
+            <w:shd w:val="clear" w:color="auto" w:fill="D5E8F0"/>
+          </w:tcPr>
+          <w:p>
+            <w:pPr>
+              <w:jc w:val="center"/>
+            </w:pPr>
+            <w:r/>
+            <w:r>
+              <w:rPr>
+                <w:rFonts w:eastAsia="Malgun Gothic"/>
+                <w:rFonts w:ascii="Malgun Gothic" w:hAnsi="Malgun Gothic"/>
+                <w:b/>
+                <w:i w:val="0"/>
+                <w:sz w:val="20"/>
+              </w:rPr>
+              <w:t>긍정 비율</w:t>
+            </w:r>
+          </w:p>
+        </w:tc>
+        <w:tc>
+          <w:tcPr>
+            <w:tcW w:type="dxa" w:w="4819"/>
+            <w:shd w:val="clear" w:color="auto" w:fill="D5E8F0"/>
+          </w:tcPr>
+          <w:p>
+            <w:pPr>
+              <w:jc w:val="center"/>
+            </w:pPr>
+            <w:r/>
+            <w:r>
+              <w:rPr>
+                <w:rFonts w:eastAsia="Malgun Gothic"/>
+                <w:rFonts w:ascii="Malgun Gothic" w:hAnsi="Malgun Gothic"/>
+                <w:b/>
+                <w:i w:val="0"/>
+                <w:sz w:val="20"/>
+              </w:rPr>
+              <w:t>긍정 추천 가능 영화 수</w:t>
+            </w:r>
+          </w:p>
+        </w:tc>
+      </w:tr>
+      <w:tr>
+        <w:tc>
+          <w:tcPr>
+            <w:tcW w:type="dxa" w:w="2268"/>
+          </w:tcPr>
+          <w:p>
+            <w:r/>
+            <w:r>
+              <w:rPr>
+                <w:rFonts w:eastAsia="Malgun Gothic"/>
+                <w:rFonts w:ascii="Malgun Gothic" w:hAnsi="Malgun Gothic"/>
+                <w:b w:val="0"/>
+                <w:i w:val="0"/>
+                <w:sz w:val="20"/>
+              </w:rPr>
+              <w:t>boring</w:t>
+            </w:r>
+          </w:p>
+        </w:tc>
+        <w:tc>
+          <w:tcPr>
+            <w:tcW w:type="dxa" w:w="1701"/>
+          </w:tcPr>
+          <w:p>
+            <w:r/>
+            <w:r>
+              <w:rPr>
+                <w:rFonts w:eastAsia="Malgun Gothic"/>
+                <w:rFonts w:ascii="Malgun Gothic" w:hAnsi="Malgun Gothic"/>
+                <w:b w:val="0"/>
+                <w:i w:val="0"/>
+                <w:sz w:val="20"/>
+              </w:rPr>
+              <w:t>3%</w:t>
+            </w:r>
+          </w:p>
+        </w:tc>
+        <w:tc>
+          <w:tcPr>
+            <w:tcW w:type="dxa" w:w="4819"/>
+          </w:tcPr>
+          <w:p>
+            <w:r/>
+            <w:r>
+              <w:rPr>
+                <w:rFonts w:eastAsia="Malgun Gothic"/>
+                <w:rFonts w:ascii="Malgun Gothic" w:hAnsi="Malgun Gothic"/>
+                <w:b w:val="0"/>
+                <w:i w:val="0"/>
+                <w:sz w:val="20"/>
+              </w:rPr>
+              <w:t>1편</w:t>
+            </w:r>
+          </w:p>
+        </w:tc>
+      </w:tr>
+      <w:tr>
+        <w:tc>
+          <w:tcPr>
+            <w:tcW w:type="dxa" w:w="2268"/>
+          </w:tcPr>
+          <w:p>
+            <w:r/>
+            <w:r>
+              <w:rPr>
+                <w:rFonts w:eastAsia="Malgun Gothic"/>
+                <w:rFonts w:ascii="Malgun Gothic" w:hAnsi="Malgun Gothic"/>
+                <w:b w:val="0"/>
+                <w:i w:val="0"/>
+                <w:sz w:val="20"/>
+              </w:rPr>
+              <w:t>disappointing</w:t>
+            </w:r>
+          </w:p>
+        </w:tc>
+        <w:tc>
+          <w:tcPr>
+            <w:tcW w:type="dxa" w:w="1701"/>
+          </w:tcPr>
+          <w:p>
+            <w:r/>
+            <w:r>
+              <w:rPr>
+                <w:rFonts w:eastAsia="Malgun Gothic"/>
+                <w:rFonts w:ascii="Malgun Gothic" w:hAnsi="Malgun Gothic"/>
+                <w:b w:val="0"/>
+                <w:i w:val="0"/>
+                <w:sz w:val="20"/>
+              </w:rPr>
+              <w:t>6%</w:t>
+            </w:r>
+          </w:p>
+        </w:tc>
+        <w:tc>
+          <w:tcPr>
+            <w:tcW w:type="dxa" w:w="4819"/>
+          </w:tcPr>
+          <w:p>
+            <w:r/>
+            <w:r>
+              <w:rPr>
+                <w:rFonts w:eastAsia="Malgun Gothic"/>
+                <w:rFonts w:ascii="Malgun Gothic" w:hAnsi="Malgun Gothic"/>
+                <w:b w:val="0"/>
+                <w:i w:val="0"/>
+                <w:sz w:val="20"/>
+              </w:rPr>
+              <w:t>1편</w:t>
+            </w:r>
+          </w:p>
+        </w:tc>
+      </w:tr>
+      <w:tr>
+        <w:tc>
+          <w:tcPr>
+            <w:tcW w:type="dxa" w:w="2268"/>
+          </w:tcPr>
+          <w:p>
+            <w:r/>
+            <w:r>
+              <w:rPr>
+                <w:rFonts w:eastAsia="Malgun Gothic"/>
+                <w:rFonts w:ascii="Malgun Gothic" w:hAnsi="Malgun Gothic"/>
+                <w:b w:val="0"/>
+                <w:i w:val="0"/>
+                <w:sz w:val="20"/>
+              </w:rPr>
+              <w:t>overrated</w:t>
+            </w:r>
+          </w:p>
+        </w:tc>
+        <w:tc>
+          <w:tcPr>
+            <w:tcW w:type="dxa" w:w="1701"/>
+          </w:tcPr>
+          <w:p>
+            <w:r/>
+            <w:r>
+              <w:rPr>
+                <w:rFonts w:eastAsia="Malgun Gothic"/>
+                <w:rFonts w:ascii="Malgun Gothic" w:hAnsi="Malgun Gothic"/>
+                <w:b w:val="0"/>
+                <w:i w:val="0"/>
+                <w:sz w:val="20"/>
+              </w:rPr>
+              <w:t>16%</w:t>
+            </w:r>
+          </w:p>
+        </w:tc>
+        <w:tc>
+          <w:tcPr>
+            <w:tcW w:type="dxa" w:w="4819"/>
+          </w:tcPr>
+          <w:p>
+            <w:r/>
+            <w:r>
+              <w:rPr>
+                <w:rFonts w:eastAsia="Malgun Gothic"/>
+                <w:rFonts w:ascii="Malgun Gothic" w:hAnsi="Malgun Gothic"/>
+                <w:b w:val="0"/>
+                <w:i w:val="0"/>
+                <w:sz w:val="20"/>
+              </w:rPr>
+              <w:t>2편</w:t>
+            </w:r>
+          </w:p>
+        </w:tc>
+      </w:tr>
+      <w:tr>
+        <w:tc>
+          <w:tcPr>
+            <w:tcW w:type="dxa" w:w="2268"/>
+          </w:tcPr>
+          <w:p>
+            <w:r/>
+            <w:r>
+              <w:rPr>
+                <w:rFonts w:eastAsia="Malgun Gothic"/>
+                <w:rFonts w:ascii="Malgun Gothic" w:hAnsi="Malgun Gothic"/>
+                <w:b w:val="0"/>
+                <w:i w:val="0"/>
+                <w:sz w:val="20"/>
+              </w:rPr>
+              <w:t>predictable</w:t>
+            </w:r>
+          </w:p>
+        </w:tc>
+        <w:tc>
+          <w:tcPr>
+            <w:tcW w:type="dxa" w:w="1701"/>
+          </w:tcPr>
+          <w:p>
+            <w:r/>
+            <w:r>
+              <w:rPr>
+                <w:rFonts w:eastAsia="Malgun Gothic"/>
+                <w:rFonts w:ascii="Malgun Gothic" w:hAnsi="Malgun Gothic"/>
+                <w:b w:val="0"/>
+                <w:i w:val="0"/>
+                <w:sz w:val="20"/>
+              </w:rPr>
+              <w:t>22%</w:t>
+            </w:r>
+          </w:p>
+        </w:tc>
+        <w:tc>
+          <w:tcPr>
+            <w:tcW w:type="dxa" w:w="4819"/>
+          </w:tcPr>
+          <w:p>
+            <w:r/>
+            <w:r>
+              <w:rPr>
+                <w:rFonts w:eastAsia="Malgun Gothic"/>
+                <w:rFonts w:ascii="Malgun Gothic" w:hAnsi="Malgun Gothic"/>
+                <w:b w:val="0"/>
+                <w:i w:val="0"/>
+                <w:sz w:val="20"/>
+              </w:rPr>
+              <w:t>45편</w:t>
+            </w:r>
+          </w:p>
+        </w:tc>
+      </w:tr>
+    </w:tbl>
+    <w:p>
+      <w:pPr>
+        <w:spacing w:after="80"/>
+      </w:pPr>
+    </w:p>
+    <w:p>
+      <w:pPr>
+        <w:spacing w:before="0" w:after="120"/>
+      </w:pPr>
+      <w:r>
+        <w:rPr>
+          <w:rFonts w:eastAsia="Malgun Gothic"/>
+          <w:rFonts w:ascii="Malgun Gothic" w:hAnsi="Malgun Gothic"/>
+          <w:b w:val="0"/>
+          <w:i w:val="0"/>
+          <w:sz w:val="22"/>
+        </w:rPr>
+        <w:t>반면 정상적인 요소는 칭찬/비판이 실제로 갈린다(funny 62%, acting 59%, dialogue 47%). 위 4개 키워드는 클릭 키워드 목록에서만 제외했다 — 인덱스 데이터는 그대로 두고 UI 노출만 막아 재계산 없이 나머지 26개 키워드만 노출한다.</w:t>
+      </w:r>
+    </w:p>
+    <w:p>
       <w:r>
         <w:br w:type="page"/>
       </w:r>
@@ -5468,7 +6303,327 @@
           <w:i w:val="0"/>
           <w:sz w:val="26"/>
         </w:rPr>
-        <w:t>11.2 한계</w:t>
+        <w:t>11.2 테스트 환경</w:t>
+      </w:r>
+    </w:p>
+    <w:tbl>
+      <w:tblPr>
+        <w:tblStyle w:val="TableGrid"/>
+        <w:tblW w:type="auto" w:w="0"/>
+        <w:tblLook w:firstColumn="1" w:firstRow="1" w:lastColumn="0" w:lastRow="0" w:noHBand="0" w:noVBand="1" w:val="04A0"/>
+      </w:tblPr>
+      <w:tblGrid>
+        <w:gridCol w:w="4536"/>
+        <w:gridCol w:w="4536"/>
+      </w:tblGrid>
+      <w:tr>
+        <w:tc>
+          <w:tcPr>
+            <w:tcW w:type="dxa" w:w="2835"/>
+            <w:shd w:val="clear" w:color="auto" w:fill="D5E8F0"/>
+          </w:tcPr>
+          <w:p>
+            <w:pPr>
+              <w:jc w:val="center"/>
+            </w:pPr>
+            <w:r/>
+            <w:r>
+              <w:rPr>
+                <w:rFonts w:eastAsia="Malgun Gothic"/>
+                <w:rFonts w:ascii="Malgun Gothic" w:hAnsi="Malgun Gothic"/>
+                <w:b/>
+                <w:i w:val="0"/>
+                <w:sz w:val="20"/>
+              </w:rPr>
+              <w:t>항목</w:t>
+            </w:r>
+          </w:p>
+        </w:tc>
+        <w:tc>
+          <w:tcPr>
+            <w:tcW w:type="dxa" w:w="5953"/>
+            <w:shd w:val="clear" w:color="auto" w:fill="D5E8F0"/>
+          </w:tcPr>
+          <w:p>
+            <w:pPr>
+              <w:jc w:val="center"/>
+            </w:pPr>
+            <w:r/>
+            <w:r>
+              <w:rPr>
+                <w:rFonts w:eastAsia="Malgun Gothic"/>
+                <w:rFonts w:ascii="Malgun Gothic" w:hAnsi="Malgun Gothic"/>
+                <w:b/>
+                <w:i w:val="0"/>
+                <w:sz w:val="20"/>
+              </w:rPr>
+              <w:t>값</w:t>
+            </w:r>
+          </w:p>
+        </w:tc>
+      </w:tr>
+      <w:tr>
+        <w:tc>
+          <w:tcPr>
+            <w:tcW w:type="dxa" w:w="2835"/>
+          </w:tcPr>
+          <w:p>
+            <w:r/>
+            <w:r>
+              <w:rPr>
+                <w:rFonts w:eastAsia="Malgun Gothic"/>
+                <w:rFonts w:ascii="Malgun Gothic" w:hAnsi="Malgun Gothic"/>
+                <w:b w:val="0"/>
+                <w:i w:val="0"/>
+                <w:sz w:val="20"/>
+              </w:rPr>
+              <w:t>OS</w:t>
+            </w:r>
+          </w:p>
+        </w:tc>
+        <w:tc>
+          <w:tcPr>
+            <w:tcW w:type="dxa" w:w="5953"/>
+          </w:tcPr>
+          <w:p>
+            <w:r/>
+            <w:r>
+              <w:rPr>
+                <w:rFonts w:eastAsia="Malgun Gothic"/>
+                <w:rFonts w:ascii="Malgun Gothic" w:hAnsi="Malgun Gothic"/>
+                <w:b w:val="0"/>
+                <w:i w:val="0"/>
+                <w:sz w:val="20"/>
+              </w:rPr>
+              <w:t>Windows 11 (10.0.26200)</w:t>
+            </w:r>
+          </w:p>
+        </w:tc>
+      </w:tr>
+      <w:tr>
+        <w:tc>
+          <w:tcPr>
+            <w:tcW w:type="dxa" w:w="2835"/>
+          </w:tcPr>
+          <w:p>
+            <w:r/>
+            <w:r>
+              <w:rPr>
+                <w:rFonts w:eastAsia="Malgun Gothic"/>
+                <w:rFonts w:ascii="Malgun Gothic" w:hAnsi="Malgun Gothic"/>
+                <w:b w:val="0"/>
+                <w:i w:val="0"/>
+                <w:sz w:val="20"/>
+              </w:rPr>
+              <w:t>CPU / RAM</w:t>
+            </w:r>
+          </w:p>
+        </w:tc>
+        <w:tc>
+          <w:tcPr>
+            <w:tcW w:type="dxa" w:w="5953"/>
+          </w:tcPr>
+          <w:p>
+            <w:r/>
+            <w:r>
+              <w:rPr>
+                <w:rFonts w:eastAsia="Malgun Gothic"/>
+                <w:rFonts w:ascii="Malgun Gothic" w:hAnsi="Malgun Gothic"/>
+                <w:b w:val="0"/>
+                <w:i w:val="0"/>
+                <w:sz w:val="20"/>
+              </w:rPr>
+              <w:t>Intel i7-12700 (20 논리코어) / 64GB</w:t>
+            </w:r>
+          </w:p>
+        </w:tc>
+      </w:tr>
+      <w:tr>
+        <w:tc>
+          <w:tcPr>
+            <w:tcW w:type="dxa" w:w="2835"/>
+          </w:tcPr>
+          <w:p>
+            <w:r/>
+            <w:r>
+              <w:rPr>
+                <w:rFonts w:eastAsia="Malgun Gothic"/>
+                <w:rFonts w:ascii="Malgun Gothic" w:hAnsi="Malgun Gothic"/>
+                <w:b w:val="0"/>
+                <w:i w:val="0"/>
+                <w:sz w:val="20"/>
+              </w:rPr>
+              <w:t>GPU</w:t>
+            </w:r>
+          </w:p>
+        </w:tc>
+        <w:tc>
+          <w:tcPr>
+            <w:tcW w:type="dxa" w:w="5953"/>
+          </w:tcPr>
+          <w:p>
+            <w:r/>
+            <w:r>
+              <w:rPr>
+                <w:rFonts w:eastAsia="Malgun Gothic"/>
+                <w:rFonts w:ascii="Malgun Gothic" w:hAnsi="Malgun Gothic"/>
+                <w:b w:val="0"/>
+                <w:i w:val="0"/>
+                <w:sz w:val="20"/>
+              </w:rPr>
+              <w:t>LSTM 학습·추론은 미사용 (CPU)</w:t>
+            </w:r>
+          </w:p>
+        </w:tc>
+      </w:tr>
+      <w:tr>
+        <w:tc>
+          <w:tcPr>
+            <w:tcW w:type="dxa" w:w="2835"/>
+          </w:tcPr>
+          <w:p>
+            <w:r/>
+            <w:r>
+              <w:rPr>
+                <w:rFonts w:eastAsia="Malgun Gothic"/>
+                <w:rFonts w:ascii="Malgun Gothic" w:hAnsi="Malgun Gothic"/>
+                <w:b w:val="0"/>
+                <w:i w:val="0"/>
+                <w:sz w:val="20"/>
+              </w:rPr>
+              <w:t>Python</w:t>
+            </w:r>
+          </w:p>
+        </w:tc>
+        <w:tc>
+          <w:tcPr>
+            <w:tcW w:type="dxa" w:w="5953"/>
+          </w:tcPr>
+          <w:p>
+            <w:r/>
+            <w:r>
+              <w:rPr>
+                <w:rFonts w:eastAsia="Malgun Gothic"/>
+                <w:rFonts w:ascii="Malgun Gothic" w:hAnsi="Malgun Gothic"/>
+                <w:b w:val="0"/>
+                <w:i w:val="0"/>
+                <w:sz w:val="20"/>
+              </w:rPr>
+              <w:t>3.9.25</w:t>
+            </w:r>
+          </w:p>
+        </w:tc>
+      </w:tr>
+      <w:tr>
+        <w:tc>
+          <w:tcPr>
+            <w:tcW w:type="dxa" w:w="2835"/>
+          </w:tcPr>
+          <w:p>
+            <w:r/>
+            <w:r>
+              <w:rPr>
+                <w:rFonts w:eastAsia="Malgun Gothic"/>
+                <w:rFonts w:ascii="Malgun Gothic" w:hAnsi="Malgun Gothic"/>
+                <w:b w:val="0"/>
+                <w:i w:val="0"/>
+                <w:sz w:val="20"/>
+              </w:rPr>
+              <w:t>TensorFlow / Keras</w:t>
+            </w:r>
+          </w:p>
+        </w:tc>
+        <w:tc>
+          <w:tcPr>
+            <w:tcW w:type="dxa" w:w="5953"/>
+          </w:tcPr>
+          <w:p>
+            <w:r/>
+            <w:r>
+              <w:rPr>
+                <w:rFonts w:eastAsia="Malgun Gothic"/>
+                <w:rFonts w:ascii="Malgun Gothic" w:hAnsi="Malgun Gothic"/>
+                <w:b w:val="0"/>
+                <w:i w:val="0"/>
+                <w:sz w:val="20"/>
+              </w:rPr>
+              <w:t>2.20.0 / 3.10.0</w:t>
+            </w:r>
+          </w:p>
+        </w:tc>
+      </w:tr>
+      <w:tr>
+        <w:tc>
+          <w:tcPr>
+            <w:tcW w:type="dxa" w:w="2835"/>
+          </w:tcPr>
+          <w:p>
+            <w:r/>
+            <w:r>
+              <w:rPr>
+                <w:rFonts w:eastAsia="Malgun Gothic"/>
+                <w:rFonts w:ascii="Malgun Gothic" w:hAnsi="Malgun Gothic"/>
+                <w:b w:val="0"/>
+                <w:i w:val="0"/>
+                <w:sz w:val="20"/>
+              </w:rPr>
+              <w:t>NumPy / scikit-learn</w:t>
+            </w:r>
+          </w:p>
+        </w:tc>
+        <w:tc>
+          <w:tcPr>
+            <w:tcW w:type="dxa" w:w="5953"/>
+          </w:tcPr>
+          <w:p>
+            <w:r/>
+            <w:r>
+              <w:rPr>
+                <w:rFonts w:eastAsia="Malgun Gothic"/>
+                <w:rFonts w:ascii="Malgun Gothic" w:hAnsi="Malgun Gothic"/>
+                <w:b w:val="0"/>
+                <w:i w:val="0"/>
+                <w:sz w:val="20"/>
+              </w:rPr>
+              <w:t>1.26.4 / 1.6.1</w:t>
+            </w:r>
+          </w:p>
+        </w:tc>
+      </w:tr>
+    </w:tbl>
+    <w:p>
+      <w:pPr>
+        <w:spacing w:after="80"/>
+      </w:pPr>
+    </w:p>
+    <w:p>
+      <w:pPr>
+        <w:spacing w:before="0" w:after="120"/>
+      </w:pPr>
+      <w:r>
+        <w:rPr>
+          <w:rFonts w:eastAsia="Malgun Gothic"/>
+          <w:rFonts w:ascii="Malgun Gothic" w:hAnsi="Malgun Gothic"/>
+          <w:b w:val="0"/>
+          <w:i w:val="0"/>
+          <w:sz w:val="22"/>
+        </w:rPr>
+        <w:t>BGE-M3 임베딩과 FAISS 인덱스 구축(1부 3장)은 별도 CUDA GPU 환경에서 수행했다. 키워드 LSTM 모델은 위 CPU 환경에서 학습·추론한다.</w:t>
+      </w:r>
+    </w:p>
+    <w:p>
+      <w:pPr>
+        <w:spacing w:before="200" w:after="100"/>
+      </w:pPr>
+      <w:r>
+        <w:rPr>
+          <w:rFonts w:eastAsia="Malgun Gothic"/>
+          <w:rFonts w:ascii="Malgun Gothic" w:hAnsi="Malgun Gothic"/>
+          <w:b/>
+          <w:i w:val="0"/>
+          <w:sz w:val="26"/>
+        </w:rPr>
+        <w:t>11.3 한계</w:t>
       </w:r>
     </w:p>
     <w:p>
@@ -5543,7 +6698,7 @@
           <w:i w:val="0"/>
           <w:sz w:val="22"/>
         </w:rPr>
-        <w:t>다의어로 인한 잔존 오분류</w:t>
+        <w:t>장르 분류의 잔존 다의어 문제</w:t>
       </w:r>
     </w:p>
     <w:p>
@@ -5558,7 +6713,7 @@
           <w:i w:val="0"/>
           <w:sz w:val="22"/>
         </w:rPr>
-        <w:t>"scary"처럼 부정적 의미를 내포한 단어가 관용적으로 긍정 맥락에 쓰이는 경우, 장르 분류나 감성 판별에 잔여 오차가 남을 수 있다. 표본 크기가 작은 오분류 사례는 Wilson 점수가 낮아 상위 결과에는 노출되지 않는 방식으로 완화된다.</w:t>
+        <w:t>9.3절의 scary 제외로 가장 두드러진 오분류는 해결했으나, 같은 다의어 문제가 다른 단어에도 남아 있다. 예를 들어 La La Land(뮤지컬)는 "haunting melody"(여운 있는 선율)의 haunting 때문에 여전히 Horror 버킷에 남는다. 다만 이런 영화는 scary 긍정 언급 자체가 적어 Wilson 점수가 낮으므로 Horror+scary 결과 목록에는 노출되지 않는다 — 버킷 소속은 부정확해도 사용자 화면에는 영향이 없다. 근본적으로는 단어 의미 구분(word-sense disambiguation)이 필요한 문제로, haunting/nightmare 등도 측정 후 동일하게 제외하면 버킷을 더 정제할 수 있으나, 현재는 결과 품질에 영향이 없어 감수한다.</w:t>
       </w:r>
     </w:p>
     <w:p>

</xml_diff>